<commit_message>
feat: enhance resume generation with profile photo cropping and layout adjustments
</commit_message>
<xml_diff>
--- a/public/XCResume2026.docx
+++ b/public/XCResume2026.docx
@@ -2,40 +2,94 @@
 <file path=word/document.xml><?xml version="1.0" encoding="utf-8"?>
 <w:document xmlns:wpc="http://schemas.microsoft.com/office/word/2010/wordprocessingCanvas" xmlns:mo="http://schemas.microsoft.com/office/mac/office/2008/main" xmlns:mc="http://schemas.openxmlformats.org/markup-compatibility/2006" xmlns:mv="urn:schemas-microsoft-com:mac:vml" xmlns:o="urn:schemas-microsoft-com:office:office" xmlns:r="http://schemas.openxmlformats.org/officeDocument/2006/relationships" xmlns:m="http://schemas.openxmlformats.org/officeDocument/2006/math" xmlns:v="urn:schemas-microsoft-com:vml" xmlns:wp14="http://schemas.microsoft.com/office/word/2010/wordprocessingDrawing" xmlns:wp="http://schemas.openxmlformats.org/drawingml/2006/wordprocessingDrawing" xmlns:w10="urn:schemas-microsoft-com:office:word" xmlns:w="http://schemas.openxmlformats.org/wordprocessingml/2006/main" xmlns:w14="http://schemas.microsoft.com/office/word/2010/wordml" xmlns:wpg="http://schemas.microsoft.com/office/word/2010/wordprocessingGroup" xmlns:wpi="http://schemas.microsoft.com/office/word/2010/wordprocessingInk" xmlns:wne="http://schemas.microsoft.com/office/word/2006/wordml" xmlns:wps="http://schemas.microsoft.com/office/word/2010/wordprocessingShape" mc:Ignorable="w14 wp14">
   <w:body>
-    <w:p>
-      <w:pPr>
-        <w:jc w:val="center"/>
-      </w:pPr>
-      <w:r>
-        <w:rPr>
-          <w:b/>
-          <w:sz w:val="32"/>
-        </w:rPr>
-        <w:t>Exiequielle John Frias (XC)</w:t>
-      </w:r>
-    </w:p>
-    <w:p>
-      <w:pPr>
-        <w:jc w:val="center"/>
-      </w:pPr>
-      <w:r>
-        <w:rPr>
-          <w:sz w:val="24"/>
-        </w:rPr>
-        <w:t>Frontend Engineer</w:t>
-      </w:r>
-    </w:p>
-    <w:p>
-      <w:pPr>
-        <w:jc w:val="center"/>
-      </w:pPr>
-      <w:r>
-        <w:rPr>
-          <w:sz w:val="20"/>
-        </w:rPr>
-        <w:t>Manila, Philippines  |  frias.exiequiellejohn@gmail.com  |  linkedin.com/in/exiequielle-john  |  github.com/jagwaw</w:t>
-      </w:r>
-    </w:p>
+    <w:tbl>
+      <w:tblPr>
+        <w:tblW w:type="auto" w:w="0"/>
+        <w:tblLayout w:type="fixed"/>
+        <w:tblLook w:firstColumn="1" w:firstRow="1" w:lastColumn="0" w:lastRow="0" w:noHBand="0" w:noVBand="1" w:val="04A0"/>
+      </w:tblPr>
+      <w:tblGrid>
+        <w:gridCol w:w="4320"/>
+        <w:gridCol w:w="4320"/>
+      </w:tblGrid>
+      <w:tr>
+        <w:tc>
+          <w:tcPr>
+            <w:tcW w:type="dxa" w:w="6480"/>
+          </w:tcPr>
+          <w:p>
+            <w:r>
+              <w:rPr>
+                <w:b/>
+                <w:sz w:val="32"/>
+              </w:rPr>
+              <w:t>Exiequielle John Frias (XC)</w:t>
+            </w:r>
+          </w:p>
+          <w:p>
+            <w:r>
+              <w:rPr>
+                <w:sz w:val="24"/>
+              </w:rPr>
+              <w:t>Frontend Engineer</w:t>
+            </w:r>
+          </w:p>
+          <w:p>
+            <w:r>
+              <w:rPr>
+                <w:sz w:val="20"/>
+              </w:rPr>
+              <w:t>Manila, Philippines  |  frias.exiequiellejohn@gmail.com  |  linkedin.com/in/exiequielle-john  |  github.com/jagwaw</w:t>
+            </w:r>
+          </w:p>
+        </w:tc>
+        <w:tc>
+          <w:tcPr>
+            <w:tcW w:type="dxa" w:w="2880"/>
+          </w:tcPr>
+          <w:p>
+            <w:pPr>
+              <w:jc w:val="right"/>
+            </w:pPr>
+            <w:r>
+              <w:drawing>
+                <wp:inline xmlns:a="http://schemas.openxmlformats.org/drawingml/2006/main" xmlns:pic="http://schemas.openxmlformats.org/drawingml/2006/picture">
+                  <wp:extent cx="1828800" cy="1828800"/>
+                  <wp:docPr id="1" name="Picture 1"/>
+                  <wp:cNvGraphicFramePr>
+                    <a:graphicFrameLocks noChangeAspect="1"/>
+                  </wp:cNvGraphicFramePr>
+                  <a:graphic>
+                    <a:graphicData uri="http://schemas.openxmlformats.org/drawingml/2006/picture">
+                      <pic:pic>
+                        <pic:nvPicPr>
+                          <pic:cNvPr id="0" name="image.jpg"/>
+                          <pic:cNvPicPr/>
+                        </pic:nvPicPr>
+                        <pic:blipFill>
+                          <a:blip r:embed="rId9"/>
+                          <a:stretch>
+                            <a:fillRect/>
+                          </a:stretch>
+                        </pic:blipFill>
+                        <pic:spPr>
+                          <a:xfrm>
+                            <a:off x="0" y="0"/>
+                            <a:ext cx="1828800" cy="1828800"/>
+                          </a:xfrm>
+                          <a:prstGeom prst="rect"/>
+                        </pic:spPr>
+                      </pic:pic>
+                    </a:graphicData>
+                  </a:graphic>
+                </wp:inline>
+              </w:drawing>
+            </w:r>
+          </w:p>
+        </w:tc>
+      </w:tr>
+    </w:tbl>
+    <w:p/>
     <w:p>
       <w:pPr>
         <w:spacing w:before="200" w:after="80"/>

</xml_diff>

<commit_message>
feat: add new 2x2 profile photo to portfolio and resume
Replace portfolio headshot with square-cropped Supreme cap photo, center it
on resume PDF/DOCX, and simplify About section image styling.

Co-authored-by: Cursor <cursoragent@cursor.com>
</commit_message>
<xml_diff>
--- a/public/XCResume2026.docx
+++ b/public/XCResume2026.docx
@@ -2,93 +2,79 @@
 <file path=word/document.xml><?xml version="1.0" encoding="utf-8"?>
 <w:document xmlns:wpc="http://schemas.microsoft.com/office/word/2010/wordprocessingCanvas" xmlns:mo="http://schemas.microsoft.com/office/mac/office/2008/main" xmlns:mc="http://schemas.openxmlformats.org/markup-compatibility/2006" xmlns:mv="urn:schemas-microsoft-com:mac:vml" xmlns:o="urn:schemas-microsoft-com:office:office" xmlns:r="http://schemas.openxmlformats.org/officeDocument/2006/relationships" xmlns:m="http://schemas.openxmlformats.org/officeDocument/2006/math" xmlns:v="urn:schemas-microsoft-com:vml" xmlns:wp14="http://schemas.microsoft.com/office/word/2010/wordprocessingDrawing" xmlns:wp="http://schemas.openxmlformats.org/drawingml/2006/wordprocessingDrawing" xmlns:w10="urn:schemas-microsoft-com:office:word" xmlns:w="http://schemas.openxmlformats.org/wordprocessingml/2006/main" xmlns:w14="http://schemas.microsoft.com/office/word/2010/wordml" xmlns:wpg="http://schemas.microsoft.com/office/word/2010/wordprocessingGroup" xmlns:wpi="http://schemas.microsoft.com/office/word/2010/wordprocessingInk" xmlns:wne="http://schemas.microsoft.com/office/word/2006/wordml" xmlns:wps="http://schemas.microsoft.com/office/word/2010/wordprocessingShape" mc:Ignorable="w14 wp14">
   <w:body>
-    <w:tbl>
-      <w:tblPr>
-        <w:tblW w:type="auto" w:w="0"/>
-        <w:tblLayout w:type="fixed"/>
-        <w:tblLook w:firstColumn="1" w:firstRow="1" w:lastColumn="0" w:lastRow="0" w:noHBand="0" w:noVBand="1" w:val="04A0"/>
-      </w:tblPr>
-      <w:tblGrid>
-        <w:gridCol w:w="4320"/>
-        <w:gridCol w:w="4320"/>
-      </w:tblGrid>
-      <w:tr>
-        <w:tc>
-          <w:tcPr>
-            <w:tcW w:type="dxa" w:w="6480"/>
-          </w:tcPr>
-          <w:p>
-            <w:r>
-              <w:rPr>
-                <w:b/>
-                <w:sz w:val="32"/>
-              </w:rPr>
-              <w:t>Exiequielle John Frias (XC)</w:t>
-            </w:r>
-          </w:p>
-          <w:p>
-            <w:r>
-              <w:rPr>
-                <w:sz w:val="24"/>
-              </w:rPr>
-              <w:t>Frontend Engineer</w:t>
-            </w:r>
-          </w:p>
-          <w:p>
-            <w:r>
-              <w:rPr>
-                <w:sz w:val="20"/>
-              </w:rPr>
-              <w:t>Manila, Philippines  |  frias.exiequiellejohn@gmail.com  |  linkedin.com/in/exiequielle-john  |  github.com/jagwaw</w:t>
-            </w:r>
-          </w:p>
-        </w:tc>
-        <w:tc>
-          <w:tcPr>
-            <w:tcW w:type="dxa" w:w="2880"/>
-          </w:tcPr>
-          <w:p>
-            <w:pPr>
-              <w:jc w:val="right"/>
-            </w:pPr>
-            <w:r>
-              <w:drawing>
-                <wp:inline xmlns:a="http://schemas.openxmlformats.org/drawingml/2006/main" xmlns:pic="http://schemas.openxmlformats.org/drawingml/2006/picture">
-                  <wp:extent cx="1828800" cy="1828800"/>
-                  <wp:docPr id="1" name="Picture 1"/>
-                  <wp:cNvGraphicFramePr>
-                    <a:graphicFrameLocks noChangeAspect="1"/>
-                  </wp:cNvGraphicFramePr>
-                  <a:graphic>
-                    <a:graphicData uri="http://schemas.openxmlformats.org/drawingml/2006/picture">
-                      <pic:pic>
-                        <pic:nvPicPr>
-                          <pic:cNvPr id="0" name="image.jpg"/>
-                          <pic:cNvPicPr/>
-                        </pic:nvPicPr>
-                        <pic:blipFill>
-                          <a:blip r:embed="rId9"/>
-                          <a:stretch>
-                            <a:fillRect/>
-                          </a:stretch>
-                        </pic:blipFill>
-                        <pic:spPr>
-                          <a:xfrm>
-                            <a:off x="0" y="0"/>
-                            <a:ext cx="1828800" cy="1828800"/>
-                          </a:xfrm>
-                          <a:prstGeom prst="rect"/>
-                        </pic:spPr>
-                      </pic:pic>
-                    </a:graphicData>
-                  </a:graphic>
-                </wp:inline>
-              </w:drawing>
-            </w:r>
-          </w:p>
-        </w:tc>
-      </w:tr>
-    </w:tbl>
+    <w:p>
+      <w:pPr>
+        <w:jc w:val="center"/>
+      </w:pPr>
+      <w:r>
+        <w:drawing>
+          <wp:inline xmlns:a="http://schemas.openxmlformats.org/drawingml/2006/main" xmlns:pic="http://schemas.openxmlformats.org/drawingml/2006/picture">
+            <wp:extent cx="1828800" cy="1828800"/>
+            <wp:docPr id="1" name="Picture 1"/>
+            <wp:cNvGraphicFramePr>
+              <a:graphicFrameLocks noChangeAspect="1"/>
+            </wp:cNvGraphicFramePr>
+            <a:graphic>
+              <a:graphicData uri="http://schemas.openxmlformats.org/drawingml/2006/picture">
+                <pic:pic>
+                  <pic:nvPicPr>
+                    <pic:cNvPr id="0" name="image.jpg"/>
+                    <pic:cNvPicPr/>
+                  </pic:nvPicPr>
+                  <pic:blipFill>
+                    <a:blip r:embed="rId9"/>
+                    <a:stretch>
+                      <a:fillRect/>
+                    </a:stretch>
+                  </pic:blipFill>
+                  <pic:spPr>
+                    <a:xfrm>
+                      <a:off x="0" y="0"/>
+                      <a:ext cx="1828800" cy="1828800"/>
+                    </a:xfrm>
+                    <a:prstGeom prst="rect"/>
+                  </pic:spPr>
+                </pic:pic>
+              </a:graphicData>
+            </a:graphic>
+          </wp:inline>
+        </w:drawing>
+      </w:r>
+    </w:p>
+    <w:p>
+      <w:pPr>
+        <w:jc w:val="center"/>
+      </w:pPr>
+      <w:r>
+        <w:rPr>
+          <w:b/>
+          <w:sz w:val="32"/>
+        </w:rPr>
+        <w:t>Exiequielle John Frias (XC)</w:t>
+      </w:r>
+    </w:p>
+    <w:p>
+      <w:pPr>
+        <w:jc w:val="center"/>
+      </w:pPr>
+      <w:r>
+        <w:rPr>
+          <w:sz w:val="24"/>
+        </w:rPr>
+        <w:t>Frontend Engineer</w:t>
+      </w:r>
+    </w:p>
+    <w:p>
+      <w:pPr>
+        <w:jc w:val="center"/>
+      </w:pPr>
+      <w:r>
+        <w:rPr>
+          <w:sz w:val="20"/>
+        </w:rPr>
+        <w:t>Manila, Philippines  |  frias.exiequiellejohn@gmail.com  |  linkedin.com/in/exiequielle-john  |  github.com/jagwaw</w:t>
+      </w:r>
+    </w:p>
     <w:p/>
     <w:p>
       <w:pPr>

</xml_diff>

<commit_message>
chore:  update portfolio content and structure to reflect Full Stack Developer role
</commit_message>
<xml_diff>
--- a/public/XCResume2026.docx
+++ b/public/XCResume2026.docx
@@ -61,7 +61,7 @@
         <w:rPr>
           <w:sz w:val="24"/>
         </w:rPr>
-        <w:t>Frontend Engineer</w:t>
+        <w:t>Full Stack Developer</w:t>
       </w:r>
     </w:p>
     <w:p>
@@ -90,7 +90,7 @@
     </w:p>
     <w:p>
       <w:r>
-        <w:t>Frontend Engineer with 8+ years of experience shipping production UI in fintech and product teams. Specialized in Vue, Nuxt, and TypeScript — from onboarding and verification flows to component systems that scale. Comfortable across the stack with Python and REST APIs when products need it.</w:t>
+        <w:t>Full Stack Developer with 8+ years of experience shipping fintech and product systems across Vue/Nuxt frontends, Django REST APIs, realtime services, async workers, and deployment pipelines. Comfortable owning features from polished UI through backend integration, CI/CD, and production serving.</w:t>
       </w:r>
     </w:p>
     <w:p>
@@ -135,7 +135,7 @@
         <w:t xml:space="preserve">Backend: </w:t>
       </w:r>
       <w:r>
-        <w:t>REST API, FastAPI, Python, Django, PHP, Symfony, SQLAlchemy, JWT</w:t>
+        <w:t>Python 3.9, Django 4.1, Django REST Framework 3.14, FastAPI, Django Channels, Daphne, Gunicorn, Celery, RabbitMQ, Kafka, REST APIs</w:t>
       </w:r>
     </w:p>
     <w:p>
@@ -146,7 +146,7 @@
         <w:t xml:space="preserve">Databases: </w:t>
       </w:r>
       <w:r>
-        <w:t>PostgreSQL, MySQL, MongoDB, Redis</w:t>
+        <w:t>PostgreSQL, Redis, MySQL, MongoDB</w:t>
       </w:r>
     </w:p>
     <w:p>
@@ -154,10 +154,10 @@
         <w:rPr>
           <w:b/>
         </w:rPr>
-        <w:t xml:space="preserve">DevOps: </w:t>
+        <w:t xml:space="preserve">CI/CD &amp; Deployment: </w:t>
       </w:r>
       <w:r>
-        <w:t>Docker, NGINX, Linux, AWS</w:t>
+        <w:t>GitLab CI, semantic-release, Ansible deployment scripts, systemd services, Docker, Docker Compose, Docker registry images, Nginx, AWS EC2/RDS/S3-style targets</w:t>
       </w:r>
     </w:p>
     <w:p>
@@ -177,7 +177,7 @@
         <w:rPr>
           <w:b/>
         </w:rPr>
-        <w:t>Billlease — Frontend Software Engineer</w:t>
+        <w:t>Billlease — Full Stack Developer</w:t>
       </w:r>
     </w:p>
     <w:p>
@@ -201,7 +201,7 @@
         <w:pStyle w:val="ListBullet"/>
       </w:pPr>
       <w:r>
-        <w:t>Integrated liveness detection using in-house Innovatrics SDK on the frontend</w:t>
+        <w:t>Built product features across Vue/Nuxt frontends and Django REST API integrations</w:t>
       </w:r>
     </w:p>
     <w:p>
@@ -209,7 +209,7 @@
         <w:pStyle w:val="ListBullet"/>
       </w:pPr>
       <w:r>
-        <w:t>Built Chat Notification UI, Bills Upload AI UI, and Pay Now Installments UI</w:t>
+        <w:t>Worked with Django Channels, Daphne, Redis, Celery, RabbitMQ, and Kafka-backed services</w:t>
       </w:r>
     </w:p>
     <w:p>
@@ -217,7 +217,7 @@
         <w:pStyle w:val="ListBullet"/>
       </w:pPr>
       <w:r>
-        <w:t>Developed FOMO feature and Mobile Load Promo Feature for user engagement campaigns</w:t>
+        <w:t>Supported GitLab CI, semantic-release, Docker registry images, and Ansible/systemd deployment scripts</w:t>
       </w:r>
     </w:p>
     <w:p>
@@ -225,7 +225,7 @@
         <w:pStyle w:val="ListBullet"/>
       </w:pPr>
       <w:r>
-        <w:t>Led frontend implementation of TOTP Retirement, migrating users to updated auth flows</w:t>
+        <w:t>Integrated liveness detection using in-house Innovatrics SDK and backend verification flows</w:t>
       </w:r>
     </w:p>
     <w:p>
@@ -233,7 +233,7 @@
         <w:pStyle w:val="ListBullet"/>
       </w:pPr>
       <w:r>
-        <w:t>Built Activation 2.0 UI, improving onboarding and account activation experience</w:t>
+        <w:t>Built Chat Notification UI, Bills Upload AI UI, Pay Now Installments UI, FOMO, and Mobile Load Promo features</w:t>
       </w:r>
     </w:p>
     <w:p>

</xml_diff>